<commit_message>
Flowchart and pseudocode completed
</commit_message>
<xml_diff>
--- a/Week 1/Flowchart for Annuity Plan.docx
+++ b/Week 1/Flowchart for Annuity Plan.docx
@@ -463,6 +463,8 @@
         <w:t xml:space="preserve"> </w:t>
       </w:r>
     </w:p>
+    <w:bookmarkStart w:id="0" w:name="_GoBack"/>
+    <w:bookmarkEnd w:id="0"/>
     <w:p>
       <w:r>
         <w:rPr>
@@ -623,15 +625,7 @@
                               <w:jc w:val="center"/>
                             </w:pPr>
                             <w:r>
-                              <w:t>Annuity Plan = PMT*[(1+R/</w:t>
-                            </w:r>
-                            <w:proofErr w:type="gramStart"/>
-                            <w:r>
-                              <w:t>n)^</w:t>
-                            </w:r>
-                            <w:proofErr w:type="gramEnd"/>
-                            <w:r>
-                              <w:t>nt-1]/[(R/n)]</w:t>
+                              <w:t>Annuity Plan = PMT*[(1+R/n)^nt-1]/[(R/n)]</w:t>
                             </w:r>
                           </w:p>
                         </w:txbxContent>
@@ -785,8 +779,6 @@
           </mc:Fallback>
         </mc:AlternateContent>
       </w:r>
-      <w:bookmarkStart w:id="0" w:name="_GoBack"/>
-      <w:bookmarkEnd w:id="0"/>
     </w:p>
     <w:sectPr>
       <w:pgSz w:w="12240" w:h="15840"/>

</xml_diff>